<commit_message>
background and enemy character is made
</commit_message>
<xml_diff>
--- a/docs/team_lead01/usecase presentation.docx
+++ b/docs/team_lead01/usecase presentation.docx
@@ -9,10 +9,7 @@
     </w:p>
     <w:p>
       <w:r>
-        <w:t>The Combat Mechanism is the core system that handles all fighting interactions between the player and the Boss</w:t>
-      </w:r>
-      <w:r>
-        <w:t>.</w:t>
+        <w:t>The Combat Mechanism is the core system that handles all fighting interactions between the player and the Boss.</w:t>
       </w:r>
     </w:p>
     <w:p>
@@ -60,10 +57,7 @@
         <w:pStyle w:val="NormalWeb"/>
       </w:pPr>
       <w:r>
-        <w:t>“Critical Hit extends the attack. Extend means it is optional and only happens under certain conditions</w:t>
-      </w:r>
-      <w:r>
-        <w:t>.”</w:t>
+        <w:t>“Critical Hit extends the attack. Extend means it is optional and only happens under certain conditions.”</w:t>
       </w:r>
     </w:p>
     <w:p>

</xml_diff>